<commit_message>
Replace project with Review 2
</commit_message>
<xml_diff>
--- a/outputs/Hospital_Transport_Tracker_Report.docx
+++ b/outputs/Hospital_Transport_Tracker_Report.docx
@@ -94,7 +94,23 @@
           <w:sz w:val="22"/>
           <w:szCs w:val="22"/>
         </w:rPr>
-        <w:t xml:space="preserve">7 September 2026</w:t>
+        <w:t xml:space="preserve">5 October 2026</w:t>
+      </w:r>
+    </w:p>
+    <w:p>
+      <w:pPr>
+        <w:spacing w:after="40"/>
+        <w:jc w:val="center"/>
+      </w:pPr>
+      <w:r>
+        <w:rPr>
+          <w:b/>
+          <w:bCs/>
+          <w:color w:val="2E5B4E"/>
+          <w:sz w:val="22"/>
+          <w:szCs w:val="22"/>
+        </w:rPr>
+        <w:t xml:space="preserve">Review 2 — Revised Edition</w:t>
       </w:r>
     </w:p>
     <w:p>
@@ -161,7 +177,7 @@
         <w:spacing w:after="80"/>
       </w:pPr>
       <w:r>
-        <w:t xml:space="preserve">Six implemented edge/failure-case tests (edge_cases.py)</w:t>
+        <w:t xml:space="preserve">Eight implemented edge/failure-case tests, 14/14 assertions passing (edge_cases.py)</w:t>
       </w:r>
     </w:p>
     <w:p>
@@ -175,6 +191,32 @@
       </w:pPr>
       <w:r>
         <w:t xml:space="preserve">Measurable experiment comparing baseline vs prototype vs target (experiment.py)</w:t>
+      </w:r>
+    </w:p>
+    <w:p>
+      <w:pPr>
+        <w:pStyle w:val="ListParagraph"/>
+        <w:numPr>
+          <w:ilvl w:val="0"/>
+          <w:numId w:val="2"/>
+        </w:numPr>
+        <w:spacing w:after="80"/>
+      </w:pPr>
+      <w:r>
+        <w:t xml:space="preserve">Review 2: a reserved-porter mitigation experiment with trade-off and error analysis (experiment_mitigation.py)</w:t>
+      </w:r>
+    </w:p>
+    <w:p>
+      <w:pPr>
+        <w:pStyle w:val="ListParagraph"/>
+        <w:numPr>
+          <w:ilvl w:val="0"/>
+          <w:numId w:val="2"/>
+        </w:numPr>
+        <w:spacing w:after="80"/>
+      </w:pPr>
+      <w:r>
+        <w:t xml:space="preserve">Review 2: a scripted end-to-end live run-through of the tracker's full staff workflow (live_runthrough.py)</w:t>
       </w:r>
     </w:p>
     <w:p>
@@ -201,6 +243,75 @@
         <w:spacing w:after="160" w:before="320"/>
       </w:pPr>
       <w:r>
+        <w:t xml:space="preserve">0. Revision Notes — What Changed for Review 2</w:t>
+      </w:r>
+    </w:p>
+    <w:p>
+      <w:pPr>
+        <w:spacing w:after="160"/>
+      </w:pPr>
+      <w:r>
+        <w:t xml:space="preserve">Review 1 closed with four named next steps. This revision addresses the first three directly and is explicit about the fourth remaining as planned future work, rather than claiming it is done:</w:t>
+      </w:r>
+    </w:p>
+    <w:p>
+      <w:pPr>
+        <w:pStyle w:val="ListParagraph"/>
+        <w:numPr>
+          <w:ilvl w:val="0"/>
+          <w:numId w:val="2"/>
+        </w:numPr>
+        <w:spacing w:after="80"/>
+      </w:pPr>
+      <w:r>
+        <w:t xml:space="preserve">Live run-through of the tracker. Addressed — Section 4 now includes a scripted, reproducible end-to-end session (live_runthrough.py) that drives the exact engine calls app.py's buttons use, through logging a messy request, reviewing a recommendation, confirming an override, and confirming a handover. The sandbox this project was built in has no internet access, so a real browser session of Streamlit could not be captured here (verified: pip install streamlit fails with no matching distribution). Jeni should still run streamlit run app.py locally — she has Python/Anaconda installed — to capture the actual on-screen walkthrough for a live demo; this script proves the underlying logic is correct and ready for that.</w:t>
+      </w:r>
+    </w:p>
+    <w:p>
+      <w:pPr>
+        <w:pStyle w:val="ListParagraph"/>
+        <w:numPr>
+          <w:ilvl w:val="0"/>
+          <w:numId w:val="2"/>
+        </w:numPr>
+        <w:spacing w:after="80"/>
+      </w:pPr>
+      <w:r>
+        <w:t xml:space="preserve">Mitigation experiment for the Emergency SLA gap. Addressed — Section 6.7 tests the proposed reserved-porter-pool idea directly, with a genuinely useful (and initially counter-intuitive) result: the straightforward version of this idea makes Emergency performance worse, not better, and the section explains why and what a better next step would look like.</w:t>
+      </w:r>
+    </w:p>
+    <w:p>
+      <w:pPr>
+        <w:pStyle w:val="ListParagraph"/>
+        <w:numPr>
+          <w:ilvl w:val="0"/>
+          <w:numId w:val="2"/>
+        </w:numPr>
+        <w:spacing w:after="80"/>
+      </w:pPr>
+      <w:r>
+        <w:t xml:space="preserve">A bug found and fixed while building the above. While cross-checking the mitigation engine against the original Review 1 engine for an exact baseline comparison, an inconsistency was found in how simulate_queue() handled an unresolved source location: it picked a porter as if the job were in a default zone, but then charged zero travel distance for that same job. This has been fixed (Section 6.1 numbers below reflect the corrected engine); the direction and shape of every Review 1 conclusion is unchanged, but the exact Emergency miss-rate figure shifts from 42.5% to 43.7% as a result. This is reported here rather than quietly — the whole point of Section 5's edge-case tests and this fix is that the system should fail visibly, including to its own author.</w:t>
+      </w:r>
+    </w:p>
+    <w:p>
+      <w:pPr>
+        <w:pStyle w:val="ListParagraph"/>
+        <w:numPr>
+          <w:ilvl w:val="0"/>
+          <w:numId w:val="2"/>
+        </w:numPr>
+        <w:spacing w:after="80"/>
+      </w:pPr>
+      <w:r>
+        <w:t xml:space="preserve">Real user validation with live hospital staff and a shared multi-user backend. Not done, by design — both require resources outside a course project's scope (real ward access; a shared database deployment). Both remain explicitly listed in Section 9's deployment checklist as prerequisites before any pilot, not silently dropped.</w:t>
+      </w:r>
+    </w:p>
+    <w:p>
+      <w:pPr>
+        <w:pStyle w:val="Heading1"/>
+        <w:spacing w:after="160" w:before="320"/>
+      </w:pPr>
+      <w:r>
         <w:t xml:space="preserve">1. Scenario Definition</w:t>
       </w:r>
     </w:p>
@@ -804,10 +915,83 @@
     </w:p>
     <w:p>
       <w:pPr>
+        <w:pStyle w:val="Heading2"/>
+        <w:spacing w:after="120" w:before="240"/>
+      </w:pPr>
+      <w:r>
+        <w:t xml:space="preserve">4.1 Demo clock (added in Review 2)</w:t>
+      </w:r>
+    </w:p>
+    <w:p>
+      <w:pPr>
         <w:spacing w:after="160"/>
       </w:pPr>
       <w:r>
-        <w:t xml:space="preserve">Note on this deliverable: the sandbox used to prepare this package has no network access to install and screenshot a live Streamlit server, so app.py is provided as complete, syntax-checked, ready-to-run code that reuses the same engine functions validated by the automated tests in Section 5. Running it locally only requires: pip install streamlit pandas, then streamlit run app.py from the project folder — consistent with the lightweight Python/Streamlit workflow already used for other data-facing tools in this portfolio.</w:t>
+        <w:t xml:space="preserve">The sample dataset is historical (24–30 August 2026). Early testing of the live tracker surfaced a genuine usability bug: comparing that historical data against the real wall-clock date made every single request appear as "Breached", since months had passed since the data was generated — a misleading demo, not a reflection of the engine's actual SLA logic. app.py now includes a sidebar "Demo clock" control that lets a reviewer pick a simulated point in time inside the dataset's week (default: 28 Aug, 14:00), so the colour-coded SLA states shown are meaningful; a checkbox switches to the real current time for when this moves to a live, non-historical deployment. Re-running the queue view at the new default clock shows a believable mix of 97 Breached / 64 On-Track requests out of 161 open, instead of 161/161 Breached.</w:t>
+      </w:r>
+    </w:p>
+    <w:p>
+      <w:pPr>
+        <w:pStyle w:val="Heading2"/>
+        <w:spacing w:after="120" w:before="240"/>
+      </w:pPr>
+      <w:r>
+        <w:t xml:space="preserve">4.2 Live run-through (Review 2)</w:t>
+      </w:r>
+    </w:p>
+    <w:p>
+      <w:pPr>
+        <w:spacing w:after="160"/>
+      </w:pPr>
+      <w:r>
+        <w:t xml:space="preserve">live_runthrough.py performs a scripted end-to-end session that calls the exact same functions app.py's UI buttons call (validate_requests, score_priority, recommend_porter), in the same order a staff member's clicks would: a new, deliberately messy request is logged (typo'd source location, no urgency stated) → the engine returns a priority score, a recommended porter, and a confidence flag → a staff member deliberately overrides the recommendation → the staff member confirms the handover. The resulting action log (reproduced below) shows every state-changing action attributed to a named staff member, never to the engine itself:</w:t>
+      </w:r>
+    </w:p>
+    <w:p>
+      <w:pPr>
+        <w:spacing w:after="20"/>
+      </w:pPr>
+      <w:r>
+        <w:rPr>
+          <w:rFonts w:ascii="Courier New" w:cs="Courier New" w:eastAsia="Courier New" w:hAnsi="Courier New"/>
+          <w:sz w:val="16"/>
+          <w:szCs w:val="16"/>
+        </w:rPr>
+        <w:t xml:space="preserve">2026-10-05 04:23:52  A. Kumar  Ward Sister  Logged new request       LIVE0001  ward a1 -&gt; ICU, urgency=(unspecified)</w:t>
+      </w:r>
+    </w:p>
+    <w:p>
+      <w:pPr>
+        <w:spacing w:after="20"/>
+      </w:pPr>
+      <w:r>
+        <w:rPr>
+          <w:rFonts w:ascii="Courier New" w:cs="Courier New" w:eastAsia="Courier New" w:hAnsi="Courier New"/>
+          <w:sz w:val="16"/>
+          <w:szCs w:val="16"/>
+        </w:rPr>
+        <w:t xml:space="preserve">2026-10-05 04:23:52  A. Kumar  Ward Sister  Overrode recommendation  LIVE0001  porter=P03 (recommended=P01)</w:t>
+      </w:r>
+    </w:p>
+    <w:p>
+      <w:pPr>
+        <w:spacing w:after="160"/>
+      </w:pPr>
+      <w:r>
+        <w:rPr>
+          <w:rFonts w:ascii="Courier New" w:cs="Courier New" w:eastAsia="Courier New" w:hAnsi="Courier New"/>
+          <w:sz w:val="16"/>
+          <w:szCs w:val="16"/>
+        </w:rPr>
+        <w:t xml:space="preserve">2026-10-05 04:23:53  A. Kumar  Ward Sister  Confirmed handover       LIVE0001  porter=P03</w:t>
+      </w:r>
+    </w:p>
+    <w:p>
+      <w:pPr>
+        <w:spacing w:after="160"/>
+      </w:pPr>
+      <w:r>
+        <w:t xml:space="preserve">The full transcript, including the engine's intermediate reasoning (resolved location, data-confidence flag, priority score, recommendation reason) at each step, is saved to outputs/live_runthrough_log.txt and is reproducible by running python3 scripts/live_runthrough.py. As noted in Section 0, this validates the logic end-to-end but is not a substitute for Jeni clicking through the actual rendered page locally, which she is able to do outside this sandbox.</w:t>
       </w:r>
     </w:p>
     <w:p>
@@ -824,7 +1008,7 @@
         <w:spacing w:after="160"/>
       </w:pPr>
       <w:r>
-        <w:t xml:space="preserve">Six realistic failure states were implemented as automated checks in edge_cases.py (all currently passing, 10/10 assertions). Each test feeds the engine deliberately broken input and checks that the system degrades safely — it must never crash, never silently drop a request, and never finalise an action without staff confirmation.</w:t>
+        <w:t xml:space="preserve">Eight realistic failure states are implemented as automated checks in edge_cases.py (all currently passing, 14/14 assertions — 6 states from Review 1, plus 2 added in Review 2 to cover the new reserved-porter-pool feature introduced in Section 6.7). Each test feeds the engine deliberately broken input and checks that the system degrades safely — it must never crash, never silently drop a request, and never finalise an action without staff confirmation.</w:t>
       </w:r>
     </w:p>
     <w:tbl>
@@ -840,15 +1024,15 @@
         </w:tblBorders>
       </w:tblPr>
       <w:tblGrid>
-        <w:gridCol w:w="700"/>
-        <w:gridCol w:w="4200"/>
+        <w:gridCol w:w="900"/>
+        <w:gridCol w:w="4000"/>
         <w:gridCol w:w="4600"/>
         <w:gridCol w:w="1500"/>
       </w:tblGrid>
       <w:tr>
         <w:tc>
           <w:tcPr>
-            <w:tcW w:type="dxa" w:w="700"/>
+            <w:tcW w:type="dxa" w:w="900"/>
             <w:shd w:fill="2E5B4E" w:val="clear"/>
           </w:tcPr>
           <w:p>
@@ -864,7 +1048,7 @@
         </w:tc>
         <w:tc>
           <w:tcPr>
-            <w:tcW w:type="dxa" w:w="4200"/>
+            <w:tcW w:type="dxa" w:w="4000"/>
             <w:shd w:fill="2E5B4E" w:val="clear"/>
           </w:tcPr>
           <w:p>
@@ -914,7 +1098,7 @@
       <w:tr>
         <w:tc>
           <w:tcPr>
-            <w:tcW w:type="dxa" w:w="700"/>
+            <w:tcW w:type="dxa" w:w="900"/>
           </w:tcPr>
           <w:p>
             <w:r>
@@ -928,7 +1112,7 @@
         </w:tc>
         <w:tc>
           <w:tcPr>
-            <w:tcW w:type="dxa" w:w="4200"/>
+            <w:tcW w:type="dxa" w:w="4000"/>
           </w:tcPr>
           <w:p>
             <w:r>
@@ -972,7 +1156,7 @@
       <w:tr>
         <w:tc>
           <w:tcPr>
-            <w:tcW w:type="dxa" w:w="700"/>
+            <w:tcW w:type="dxa" w:w="900"/>
           </w:tcPr>
           <w:p>
             <w:r>
@@ -986,7 +1170,7 @@
         </w:tc>
         <w:tc>
           <w:tcPr>
-            <w:tcW w:type="dxa" w:w="4200"/>
+            <w:tcW w:type="dxa" w:w="4000"/>
           </w:tcPr>
           <w:p>
             <w:r>
@@ -1030,7 +1214,7 @@
       <w:tr>
         <w:tc>
           <w:tcPr>
-            <w:tcW w:type="dxa" w:w="700"/>
+            <w:tcW w:type="dxa" w:w="900"/>
           </w:tcPr>
           <w:p>
             <w:r>
@@ -1044,7 +1228,7 @@
         </w:tc>
         <w:tc>
           <w:tcPr>
-            <w:tcW w:type="dxa" w:w="4200"/>
+            <w:tcW w:type="dxa" w:w="4000"/>
           </w:tcPr>
           <w:p>
             <w:r>
@@ -1088,7 +1272,7 @@
       <w:tr>
         <w:tc>
           <w:tcPr>
-            <w:tcW w:type="dxa" w:w="700"/>
+            <w:tcW w:type="dxa" w:w="900"/>
           </w:tcPr>
           <w:p>
             <w:r>
@@ -1102,7 +1286,7 @@
         </w:tc>
         <w:tc>
           <w:tcPr>
-            <w:tcW w:type="dxa" w:w="4200"/>
+            <w:tcW w:type="dxa" w:w="4000"/>
           </w:tcPr>
           <w:p>
             <w:r>
@@ -1146,7 +1330,7 @@
       <w:tr>
         <w:tc>
           <w:tcPr>
-            <w:tcW w:type="dxa" w:w="700"/>
+            <w:tcW w:type="dxa" w:w="900"/>
           </w:tcPr>
           <w:p>
             <w:r>
@@ -1160,7 +1344,7 @@
         </w:tc>
         <w:tc>
           <w:tcPr>
-            <w:tcW w:type="dxa" w:w="4200"/>
+            <w:tcW w:type="dxa" w:w="4000"/>
           </w:tcPr>
           <w:p>
             <w:r>
@@ -1204,7 +1388,7 @@
       <w:tr>
         <w:tc>
           <w:tcPr>
-            <w:tcW w:type="dxa" w:w="700"/>
+            <w:tcW w:type="dxa" w:w="900"/>
           </w:tcPr>
           <w:p>
             <w:r>
@@ -1218,7 +1402,7 @@
         </w:tc>
         <w:tc>
           <w:tcPr>
-            <w:tcW w:type="dxa" w:w="4200"/>
+            <w:tcW w:type="dxa" w:w="4000"/>
           </w:tcPr>
           <w:p>
             <w:r>
@@ -1241,6 +1425,122 @@
                 <w:bCs w:val="false"/>
               </w:rPr>
               <w:t xml:space="preserve">No crash; every request escalated, no fabricated assignment</w:t>
+            </w:r>
+          </w:p>
+        </w:tc>
+        <w:tc>
+          <w:tcPr>
+            <w:tcW w:type="dxa" w:w="1500"/>
+          </w:tcPr>
+          <w:p>
+            <w:r>
+              <w:rPr>
+                <w:b w:val="false"/>
+                <w:bCs w:val="false"/>
+              </w:rPr>
+              <w:t xml:space="preserve">PASS</w:t>
+            </w:r>
+          </w:p>
+        </w:tc>
+      </w:tr>
+      <w:tr>
+        <w:tc>
+          <w:tcPr>
+            <w:tcW w:type="dxa" w:w="900"/>
+          </w:tcPr>
+          <w:p>
+            <w:r>
+              <w:rPr>
+                <w:b w:val="false"/>
+                <w:bCs w:val="false"/>
+              </w:rPr>
+              <w:t xml:space="preserve">7 (R2)</w:t>
+            </w:r>
+          </w:p>
+        </w:tc>
+        <w:tc>
+          <w:tcPr>
+            <w:tcW w:type="dxa" w:w="4000"/>
+          </w:tcPr>
+          <w:p>
+            <w:r>
+              <w:rPr>
+                <w:b w:val="false"/>
+                <w:bCs w:val="false"/>
+              </w:rPr>
+              <w:t xml:space="preserve">Reserved Emergency pool itself overwhelmed (4 Emergencies, 1 reserved porter)</w:t>
+            </w:r>
+          </w:p>
+        </w:tc>
+        <w:tc>
+          <w:tcPr>
+            <w:tcW w:type="dxa" w:w="4600"/>
+          </w:tcPr>
+          <w:p>
+            <w:r>
+              <w:rPr>
+                <w:b w:val="false"/>
+                <w:bCs w:val="false"/>
+              </w:rPr>
+              <w:t xml:space="preserve">Overflows into the general pool rather than leaving a request unassigned</w:t>
+            </w:r>
+          </w:p>
+        </w:tc>
+        <w:tc>
+          <w:tcPr>
+            <w:tcW w:type="dxa" w:w="1500"/>
+          </w:tcPr>
+          <w:p>
+            <w:r>
+              <w:rPr>
+                <w:b w:val="false"/>
+                <w:bCs w:val="false"/>
+              </w:rPr>
+              <w:t xml:space="preserve">PASS</w:t>
+            </w:r>
+          </w:p>
+        </w:tc>
+      </w:tr>
+      <w:tr>
+        <w:tc>
+          <w:tcPr>
+            <w:tcW w:type="dxa" w:w="900"/>
+          </w:tcPr>
+          <w:p>
+            <w:r>
+              <w:rPr>
+                <w:b w:val="false"/>
+                <w:bCs w:val="false"/>
+              </w:rPr>
+              <w:t xml:space="preserve">8 (R2)</w:t>
+            </w:r>
+          </w:p>
+        </w:tc>
+        <w:tc>
+          <w:tcPr>
+            <w:tcW w:type="dxa" w:w="4000"/>
+          </w:tcPr>
+          <w:p>
+            <w:r>
+              <w:rPr>
+                <w:b w:val="false"/>
+                <w:bCs w:val="false"/>
+              </w:rPr>
+              <w:t xml:space="preserve">Reserved porter ID doesn't exist in the roster (config typo)</w:t>
+            </w:r>
+          </w:p>
+        </w:tc>
+        <w:tc>
+          <w:tcPr>
+            <w:tcW w:type="dxa" w:w="4600"/>
+          </w:tcPr>
+          <w:p>
+            <w:r>
+              <w:rPr>
+                <w:b w:val="false"/>
+                <w:bCs w:val="false"/>
+              </w:rPr>
+              <w:t xml:space="preserve">Falls back to the general pool instead of crashing or dropping all Emergencies</w:t>
             </w:r>
           </w:p>
         </w:tc>
@@ -1620,7 +1920,7 @@
                 <w:b w:val="false"/>
                 <w:bCs w:val="false"/>
               </w:rPr>
-              <w:t xml:space="preserve">42.5%</w:t>
+              <w:t xml:space="preserve">43.7%</w:t>
             </w:r>
           </w:p>
         </w:tc>
@@ -1648,7 +1948,7 @@
                 <w:b w:val="false"/>
                 <w:bCs w:val="false"/>
               </w:rPr>
-              <w:t xml:space="preserve">+57.5</w:t>
+              <w:t xml:space="preserve">+56.3</w:t>
             </w:r>
           </w:p>
         </w:tc>
@@ -1887,7 +2187,7 @@
         <w:spacing w:after="160"/>
       </w:pPr>
       <w:r>
-        <w:t xml:space="preserve">Weighted across all 627 requests with a resolved urgency, overall missed/late rate falls from 16.9% (baseline) to 5.9% (prototype) — an 11.0 percentage-point improvement from coordination logic alone, using identical demand and an identical porter roster.</w:t>
+        <w:t xml:space="preserve">Weighted across all 662 requests with a resolved urgency, overall missed/late rate falls from 16.9% (baseline) to 6.1% (prototype) — a 10.8 percentage-point improvement from coordination logic alone, using identical demand and an identical porter roster.</w:t>
       </w:r>
     </w:p>
     <w:p>
@@ -2041,7 +2341,7 @@
         <w:spacing w:after="160"/>
       </w:pPr>
       <w:r>
-        <w:t xml:space="preserve">Honesty about remaining failure is part of this deliverable. 37 of 87 Emergency requests (42.5%) were still classified Completed-Late by the prototype, missing the 5% target. Root-cause analysis of these 37 cases:</w:t>
+        <w:t xml:space="preserve">Honesty about remaining failure is part of this deliverable. 38 of 87 Emergency requests (43.7%) were still classified Completed-Late by the prototype, missing the 5% target. Root-cause analysis of these 38 cases:</w:t>
       </w:r>
     </w:p>
     <w:p>
@@ -2080,7 +2380,7 @@
         <w:spacing w:after="80"/>
       </w:pPr>
       <w:r>
-        <w:t xml:space="preserve">The implication for the hospital, not just the software, is that Emergency-tier transfers likely need a dedicated, pre-positioned porter reserve near high-emergency zones (ICU, ED, OT complex) rather than relying solely on smarter queueing of the existing shared pool. This is exactly the kind of insight a working prototype and a measurable experiment surface, and a concept slide would not.</w:t>
+        <w:t xml:space="preserve">Review 1 hypothesised that the hospital, not just the software, likely needs a dedicated, pre-positioned porter reserve near high-emergency zones. Section 6.7 tests that hypothesis directly against the same dataset and finds it is more subtle than it first appears — a straightforward reserve makes things worse, not better, for the reason explained there.</w:t>
       </w:r>
     </w:p>
     <w:p>
@@ -2137,6 +2437,641 @@
       </w:pPr>
       <w:r>
         <w:t xml:space="preserve">Fail-visible behaviour under missing/bad data — Section 5's edge cases show the rule-based engine degrades to explicit escalation under bad input; a black-box model would more likely produce a confident-looking but wrong recommendation on the same messy input, which is a worse failure mode in a clinical setting.</w:t>
+      </w:r>
+    </w:p>
+    <w:p>
+      <w:pPr>
+        <w:pStyle w:val="Heading2"/>
+        <w:spacing w:after="120" w:before="240"/>
+      </w:pPr>
+      <w:r>
+        <w:t xml:space="preserve">6.7 Mitigation Experiment (Review 2): Reserved Emergency Porter Pool</w:t>
+      </w:r>
+    </w:p>
+    <w:p>
+      <w:pPr>
+        <w:spacing w:after="160"/>
+      </w:pPr>
+      <w:r>
+        <w:t xml:space="preserve">Hypothesis, from Section 6.5: dedicating one or two porters exclusively to Emergency-tier requests (a real "STAT porter" pattern some hospitals use) should close most of the remaining Emergency SLA gap, at some cost to Urgent/Routine wait times. This was implemented as simulate_queue_with_reserve() and tested against the identical 662-request stream used throughout Section 6, in three configurations: 0 reserved porters (the Section 6 prototype, unchanged), 1 reserved porter (P03, the zone with the lowest average distance to all other zones), and 2 reserved porters (P03 + P08, covering the two zones that together produce 37% of Emergency calls). An Emergency request only draws from the reserved pool if its wait there would stay under 5 minutes; otherwise it overflows into the general pool, so an empty reservation is never allowed to delay a live Emergency case.</w:t>
+      </w:r>
+    </w:p>
+    <w:tbl>
+      <w:tblPr>
+        <w:tblW w:type="dxa" w:w="10300"/>
+        <w:tblBorders>
+          <w:top w:val="single" w:color="auto" w:sz="4"/>
+          <w:left w:val="single" w:color="auto" w:sz="4"/>
+          <w:bottom w:val="single" w:color="auto" w:sz="4"/>
+          <w:right w:val="single" w:color="auto" w:sz="4"/>
+          <w:insideH w:val="single" w:color="auto" w:sz="4"/>
+          <w:insideV w:val="single" w:color="auto" w:sz="4"/>
+        </w:tblBorders>
+      </w:tblPr>
+      <w:tblGrid>
+        <w:gridCol w:w="2600"/>
+        <w:gridCol w:w="2200"/>
+        <w:gridCol w:w="1800"/>
+        <w:gridCol w:w="1800"/>
+        <w:gridCol w:w="1900"/>
+      </w:tblGrid>
+      <w:tr>
+        <w:tc>
+          <w:tcPr>
+            <w:tcW w:type="dxa" w:w="2600"/>
+            <w:shd w:fill="2E5B4E" w:val="clear"/>
+          </w:tcPr>
+          <w:p>
+            <w:r>
+              <w:rPr>
+                <w:b/>
+                <w:bCs/>
+                <w:color w:val="FFFFFF"/>
+              </w:rPr>
+              <w:t xml:space="preserve">Configuration</w:t>
+            </w:r>
+          </w:p>
+        </w:tc>
+        <w:tc>
+          <w:tcPr>
+            <w:tcW w:type="dxa" w:w="2200"/>
+            <w:shd w:fill="2E5B4E" w:val="clear"/>
+          </w:tcPr>
+          <w:p>
+            <w:r>
+              <w:rPr>
+                <w:b/>
+                <w:bCs/>
+                <w:color w:val="FFFFFF"/>
+              </w:rPr>
+              <w:t xml:space="preserve">Urgency</w:t>
+            </w:r>
+          </w:p>
+        </w:tc>
+        <w:tc>
+          <w:tcPr>
+            <w:tcW w:type="dxa" w:w="1800"/>
+            <w:shd w:fill="2E5B4E" w:val="clear"/>
+          </w:tcPr>
+          <w:p>
+            <w:r>
+              <w:rPr>
+                <w:b/>
+                <w:bCs/>
+                <w:color w:val="FFFFFF"/>
+              </w:rPr>
+              <w:t xml:space="preserve">% missed/late</w:t>
+            </w:r>
+          </w:p>
+        </w:tc>
+        <w:tc>
+          <w:tcPr>
+            <w:tcW w:type="dxa" w:w="1800"/>
+            <w:shd w:fill="2E5B4E" w:val="clear"/>
+          </w:tcPr>
+          <w:p>
+            <w:r>
+              <w:rPr>
+                <w:b/>
+                <w:bCs/>
+                <w:color w:val="FFFFFF"/>
+              </w:rPr>
+              <w:t xml:space="preserve">vs target</w:t>
+            </w:r>
+          </w:p>
+        </w:tc>
+        <w:tc>
+          <w:tcPr>
+            <w:tcW w:type="dxa" w:w="1900"/>
+            <w:shd w:fill="2E5B4E" w:val="clear"/>
+          </w:tcPr>
+          <w:p>
+            <w:r>
+              <w:rPr>
+                <w:b/>
+                <w:bCs/>
+                <w:color w:val="FFFFFF"/>
+              </w:rPr>
+              <w:t xml:space="preserve">Meets target?</w:t>
+            </w:r>
+          </w:p>
+        </w:tc>
+      </w:tr>
+      <w:tr>
+        <w:tc>
+          <w:tcPr>
+            <w:tcW w:type="dxa" w:w="2600"/>
+          </w:tcPr>
+          <w:p>
+            <w:r>
+              <w:rPr>
+                <w:b w:val="false"/>
+                <w:bCs w:val="false"/>
+              </w:rPr>
+              <w:t xml:space="preserve">0 reserved (baseline)</w:t>
+            </w:r>
+          </w:p>
+        </w:tc>
+        <w:tc>
+          <w:tcPr>
+            <w:tcW w:type="dxa" w:w="2200"/>
+          </w:tcPr>
+          <w:p>
+            <w:r>
+              <w:rPr>
+                <w:b w:val="false"/>
+                <w:bCs w:val="false"/>
+              </w:rPr>
+              <w:t xml:space="preserve">Emergency</w:t>
+            </w:r>
+          </w:p>
+        </w:tc>
+        <w:tc>
+          <w:tcPr>
+            <w:tcW w:type="dxa" w:w="1800"/>
+          </w:tcPr>
+          <w:p>
+            <w:r>
+              <w:rPr>
+                <w:b w:val="false"/>
+                <w:bCs w:val="false"/>
+              </w:rPr>
+              <w:t xml:space="preserve">43.7%</w:t>
+            </w:r>
+          </w:p>
+        </w:tc>
+        <w:tc>
+          <w:tcPr>
+            <w:tcW w:type="dxa" w:w="1800"/>
+          </w:tcPr>
+          <w:p>
+            <w:r>
+              <w:rPr>
+                <w:b w:val="false"/>
+                <w:bCs w:val="false"/>
+              </w:rPr>
+              <w:t xml:space="preserve">5.0%</w:t>
+            </w:r>
+          </w:p>
+        </w:tc>
+        <w:tc>
+          <w:tcPr>
+            <w:tcW w:type="dxa" w:w="1900"/>
+          </w:tcPr>
+          <w:p>
+            <w:r>
+              <w:rPr>
+                <w:b w:val="false"/>
+                <w:bCs w:val="false"/>
+              </w:rPr>
+              <w:t xml:space="preserve">No</w:t>
+            </w:r>
+          </w:p>
+        </w:tc>
+      </w:tr>
+      <w:tr>
+        <w:tc>
+          <w:tcPr>
+            <w:tcW w:type="dxa" w:w="2600"/>
+          </w:tcPr>
+          <w:p>
+            <w:r>
+              <w:rPr>
+                <w:b w:val="false"/>
+                <w:bCs w:val="false"/>
+              </w:rPr>
+              <w:t xml:space="preserve">0 reserved (baseline)</w:t>
+            </w:r>
+          </w:p>
+        </w:tc>
+        <w:tc>
+          <w:tcPr>
+            <w:tcW w:type="dxa" w:w="2200"/>
+          </w:tcPr>
+          <w:p>
+            <w:r>
+              <w:rPr>
+                <w:b w:val="false"/>
+                <w:bCs w:val="false"/>
+              </w:rPr>
+              <w:t xml:space="preserve">Urgent / Routine</w:t>
+            </w:r>
+          </w:p>
+        </w:tc>
+        <w:tc>
+          <w:tcPr>
+            <w:tcW w:type="dxa" w:w="1800"/>
+          </w:tcPr>
+          <w:p>
+            <w:r>
+              <w:rPr>
+                <w:b w:val="false"/>
+                <w:bCs w:val="false"/>
+              </w:rPr>
+              <w:t xml:space="preserve">0.0% / 0.0%</w:t>
+            </w:r>
+          </w:p>
+        </w:tc>
+        <w:tc>
+          <w:tcPr>
+            <w:tcW w:type="dxa" w:w="1800"/>
+          </w:tcPr>
+          <w:p>
+            <w:r>
+              <w:rPr>
+                <w:b w:val="false"/>
+                <w:bCs w:val="false"/>
+              </w:rPr>
+              <w:t xml:space="preserve">10.0% / 15.0%</w:t>
+            </w:r>
+          </w:p>
+        </w:tc>
+        <w:tc>
+          <w:tcPr>
+            <w:tcW w:type="dxa" w:w="1900"/>
+          </w:tcPr>
+          <w:p>
+            <w:r>
+              <w:rPr>
+                <w:b w:val="false"/>
+                <w:bCs w:val="false"/>
+              </w:rPr>
+              <w:t xml:space="preserve">Yes / Yes</w:t>
+            </w:r>
+          </w:p>
+        </w:tc>
+      </w:tr>
+      <w:tr>
+        <w:tc>
+          <w:tcPr>
+            <w:tcW w:type="dxa" w:w="2600"/>
+          </w:tcPr>
+          <w:p>
+            <w:r>
+              <w:rPr>
+                <w:b w:val="false"/>
+                <w:bCs w:val="false"/>
+              </w:rPr>
+              <w:t xml:space="preserve">1 reserved (P03)</w:t>
+            </w:r>
+          </w:p>
+        </w:tc>
+        <w:tc>
+          <w:tcPr>
+            <w:tcW w:type="dxa" w:w="2200"/>
+          </w:tcPr>
+          <w:p>
+            <w:r>
+              <w:rPr>
+                <w:b w:val="false"/>
+                <w:bCs w:val="false"/>
+              </w:rPr>
+              <w:t xml:space="preserve">Emergency</w:t>
+            </w:r>
+          </w:p>
+        </w:tc>
+        <w:tc>
+          <w:tcPr>
+            <w:tcW w:type="dxa" w:w="1800"/>
+          </w:tcPr>
+          <w:p>
+            <w:r>
+              <w:rPr>
+                <w:b w:val="false"/>
+                <w:bCs w:val="false"/>
+              </w:rPr>
+              <w:t xml:space="preserve">50.6%</w:t>
+            </w:r>
+          </w:p>
+        </w:tc>
+        <w:tc>
+          <w:tcPr>
+            <w:tcW w:type="dxa" w:w="1800"/>
+          </w:tcPr>
+          <w:p>
+            <w:r>
+              <w:rPr>
+                <w:b w:val="false"/>
+                <w:bCs w:val="false"/>
+              </w:rPr>
+              <w:t xml:space="preserve">5.0%</w:t>
+            </w:r>
+          </w:p>
+        </w:tc>
+        <w:tc>
+          <w:tcPr>
+            <w:tcW w:type="dxa" w:w="1900"/>
+          </w:tcPr>
+          <w:p>
+            <w:r>
+              <w:rPr>
+                <w:b w:val="false"/>
+                <w:bCs w:val="false"/>
+              </w:rPr>
+              <w:t xml:space="preserve">No — worse</w:t>
+            </w:r>
+          </w:p>
+        </w:tc>
+      </w:tr>
+      <w:tr>
+        <w:tc>
+          <w:tcPr>
+            <w:tcW w:type="dxa" w:w="2600"/>
+          </w:tcPr>
+          <w:p>
+            <w:r>
+              <w:rPr>
+                <w:b w:val="false"/>
+                <w:bCs w:val="false"/>
+              </w:rPr>
+              <w:t xml:space="preserve">1 reserved (P03)</w:t>
+            </w:r>
+          </w:p>
+        </w:tc>
+        <w:tc>
+          <w:tcPr>
+            <w:tcW w:type="dxa" w:w="2200"/>
+          </w:tcPr>
+          <w:p>
+            <w:r>
+              <w:rPr>
+                <w:b w:val="false"/>
+                <w:bCs w:val="false"/>
+              </w:rPr>
+              <w:t xml:space="preserve">Urgent / Routine</w:t>
+            </w:r>
+          </w:p>
+        </w:tc>
+        <w:tc>
+          <w:tcPr>
+            <w:tcW w:type="dxa" w:w="1800"/>
+          </w:tcPr>
+          <w:p>
+            <w:r>
+              <w:rPr>
+                <w:b w:val="false"/>
+                <w:bCs w:val="false"/>
+              </w:rPr>
+              <w:t xml:space="preserve">0.0% / 0.0%</w:t>
+            </w:r>
+          </w:p>
+        </w:tc>
+        <w:tc>
+          <w:tcPr>
+            <w:tcW w:type="dxa" w:w="1800"/>
+          </w:tcPr>
+          <w:p>
+            <w:r>
+              <w:rPr>
+                <w:b w:val="false"/>
+                <w:bCs w:val="false"/>
+              </w:rPr>
+              <w:t xml:space="preserve">10.0% / 15.0%</w:t>
+            </w:r>
+          </w:p>
+        </w:tc>
+        <w:tc>
+          <w:tcPr>
+            <w:tcW w:type="dxa" w:w="1900"/>
+          </w:tcPr>
+          <w:p>
+            <w:r>
+              <w:rPr>
+                <w:b w:val="false"/>
+                <w:bCs w:val="false"/>
+              </w:rPr>
+              <w:t xml:space="preserve">Yes / Yes</w:t>
+            </w:r>
+          </w:p>
+        </w:tc>
+      </w:tr>
+      <w:tr>
+        <w:tc>
+          <w:tcPr>
+            <w:tcW w:type="dxa" w:w="2600"/>
+          </w:tcPr>
+          <w:p>
+            <w:r>
+              <w:rPr>
+                <w:b w:val="false"/>
+                <w:bCs w:val="false"/>
+              </w:rPr>
+              <w:t xml:space="preserve">2 reserved (P03+P08)</w:t>
+            </w:r>
+          </w:p>
+        </w:tc>
+        <w:tc>
+          <w:tcPr>
+            <w:tcW w:type="dxa" w:w="2200"/>
+          </w:tcPr>
+          <w:p>
+            <w:r>
+              <w:rPr>
+                <w:b w:val="false"/>
+                <w:bCs w:val="false"/>
+              </w:rPr>
+              <w:t xml:space="preserve">Emergency</w:t>
+            </w:r>
+          </w:p>
+        </w:tc>
+        <w:tc>
+          <w:tcPr>
+            <w:tcW w:type="dxa" w:w="1800"/>
+          </w:tcPr>
+          <w:p>
+            <w:r>
+              <w:rPr>
+                <w:b w:val="false"/>
+                <w:bCs w:val="false"/>
+              </w:rPr>
+              <w:t xml:space="preserve">48.3%</w:t>
+            </w:r>
+          </w:p>
+        </w:tc>
+        <w:tc>
+          <w:tcPr>
+            <w:tcW w:type="dxa" w:w="1800"/>
+          </w:tcPr>
+          <w:p>
+            <w:r>
+              <w:rPr>
+                <w:b w:val="false"/>
+                <w:bCs w:val="false"/>
+              </w:rPr>
+              <w:t xml:space="preserve">5.0%</w:t>
+            </w:r>
+          </w:p>
+        </w:tc>
+        <w:tc>
+          <w:tcPr>
+            <w:tcW w:type="dxa" w:w="1900"/>
+          </w:tcPr>
+          <w:p>
+            <w:r>
+              <w:rPr>
+                <w:b w:val="false"/>
+                <w:bCs w:val="false"/>
+              </w:rPr>
+              <w:t xml:space="preserve">No — worse</w:t>
+            </w:r>
+          </w:p>
+        </w:tc>
+      </w:tr>
+      <w:tr>
+        <w:tc>
+          <w:tcPr>
+            <w:tcW w:type="dxa" w:w="2600"/>
+          </w:tcPr>
+          <w:p>
+            <w:r>
+              <w:rPr>
+                <w:b w:val="false"/>
+                <w:bCs w:val="false"/>
+              </w:rPr>
+              <w:t xml:space="preserve">2 reserved (P03+P08)</w:t>
+            </w:r>
+          </w:p>
+        </w:tc>
+        <w:tc>
+          <w:tcPr>
+            <w:tcW w:type="dxa" w:w="2200"/>
+          </w:tcPr>
+          <w:p>
+            <w:r>
+              <w:rPr>
+                <w:b w:val="false"/>
+                <w:bCs w:val="false"/>
+              </w:rPr>
+              <w:t xml:space="preserve">Urgent / Routine</w:t>
+            </w:r>
+          </w:p>
+        </w:tc>
+        <w:tc>
+          <w:tcPr>
+            <w:tcW w:type="dxa" w:w="1800"/>
+          </w:tcPr>
+          <w:p>
+            <w:r>
+              <w:rPr>
+                <w:b w:val="false"/>
+                <w:bCs w:val="false"/>
+              </w:rPr>
+              <w:t xml:space="preserve">0.0% / 0.0%</w:t>
+            </w:r>
+          </w:p>
+        </w:tc>
+        <w:tc>
+          <w:tcPr>
+            <w:tcW w:type="dxa" w:w="1800"/>
+          </w:tcPr>
+          <w:p>
+            <w:r>
+              <w:rPr>
+                <w:b w:val="false"/>
+                <w:bCs w:val="false"/>
+              </w:rPr>
+              <w:t xml:space="preserve">10.0% / 15.0%</w:t>
+            </w:r>
+          </w:p>
+        </w:tc>
+        <w:tc>
+          <w:tcPr>
+            <w:tcW w:type="dxa" w:w="1900"/>
+          </w:tcPr>
+          <w:p>
+            <w:r>
+              <w:rPr>
+                <w:b w:val="false"/>
+                <w:bCs w:val="false"/>
+              </w:rPr>
+              <w:t xml:space="preserve">Yes / Yes</w:t>
+            </w:r>
+          </w:p>
+        </w:tc>
+      </w:tr>
+    </w:tbl>
+    <w:p>
+      <w:pPr>
+        <w:jc w:val="center"/>
+      </w:pPr>
+      <w:r>
+        <w:drawing>
+          <wp:inline distT="0" distB="0" distL="0" distR="0">
+            <wp:extent cx="4381500" cy="2743200"/>
+            <wp:effectExtent t="0" r="0" b="0" l="0"/>
+            <wp:docPr id="1" name="" descr="" title=""/>
+            <wp:cNvGraphicFramePr>
+              <a:graphicFrameLocks xmlns:a="http://schemas.openxmlformats.org/drawingml/2006/main" noChangeAspect="1"/>
+            </wp:cNvGraphicFramePr>
+            <a:graphic xmlns:a="http://schemas.openxmlformats.org/drawingml/2006/main">
+              <a:graphicData uri="http://schemas.openxmlformats.org/drawingml/2006/picture">
+                <pic:pic xmlns:pic="http://schemas.openxmlformats.org/drawingml/2006/picture">
+                  <pic:nvPicPr>
+                    <pic:cNvPr id="0" name="" descr=""/>
+                    <pic:cNvPicPr>
+                      <a:picLocks noChangeAspect="1" noChangeArrowheads="1"/>
+                    </pic:cNvPicPr>
+                  </pic:nvPicPr>
+                  <pic:blipFill>
+                    <a:blip r:embed="rId10" cstate="none"/>
+                    <a:srcRect/>
+                    <a:stretch>
+                      <a:fillRect/>
+                    </a:stretch>
+                  </pic:blipFill>
+                  <pic:spPr bwMode="auto">
+                    <a:xfrm>
+                      <a:off x="0" y="0"/>
+                      <a:ext cx="4381500" cy="2743200"/>
+                    </a:xfrm>
+                    <a:prstGeom prst="rect">
+                      <a:avLst/>
+                    </a:prstGeom>
+                  </pic:spPr>
+                </pic:pic>
+              </a:graphicData>
+            </a:graphic>
+          </wp:inline>
+        </w:drawing>
+      </w:r>
+    </w:p>
+    <w:p>
+      <w:pPr>
+        <w:spacing w:after="200"/>
+        <w:jc w:val="center"/>
+      </w:pPr>
+      <w:r>
+        <w:rPr>
+          <w:i/>
+          <w:iCs/>
+          <w:sz w:val="20"/>
+          <w:szCs w:val="20"/>
+        </w:rPr>
+        <w:t xml:space="preserve">Figure 4. Reserving porters for Emergency-only use did not reduce Emergency misses in this dataset — it increased them, while leaving the already-passing Urgent/Routine tiers unchanged.</w:t>
+      </w:r>
+    </w:p>
+    <w:p>
+      <w:pPr>
+        <w:spacing w:after="160"/>
+      </w:pPr>
+      <w:r>
+        <w:t xml:space="preserve">The result is counter-intuitive and is reported as found, not adjusted to fit the hypothesis: reserving porters made Emergency performance worse (43.7% -&gt; 50.6% missed/late with 1 reserved porter), not better, while Urgent and Routine were completely unaffected (they were already at 0% and had headroom to spare). Tracing individual requests (prototype_pool_used column) explains why: with only 87 Emergency calls spread across a full week, concentrating them onto 1-2 specific porters creates queueing for Emergency itself whenever two calls land close together — a situation the unrestricted 8-porter pool simply absorbed by sending the second call to any other free porter. Reservation does not add capacity; it removes flexibility, and with this demand pattern the flexibility was doing more work than the dedicated-porter idea assumed.</w:t>
+      </w:r>
+    </w:p>
+    <w:p>
+      <w:pPr>
+        <w:spacing w:after="160"/>
+      </w:pPr>
+      <w:r>
+        <w:t xml:space="preserve">As a sanity check on whether this is a staffing (capacity) problem rather than an allocation (policy) problem, the same stream was re-run with 1 and 2 extra generalist porters added to the shared pool instead of reserving existing ones: Emergency missed/late fell to 36.8% with +1 porter and 37.9% with +2 — a real improvement, but still well short of the 5% target. This supports Review 1's original diagnosis in Section 6.5: part of the remaining gap is a hard physical-travel-time constraint against an aggressive 10-minute SLA, not something any queueing or staffing policy alone can fully close.</w:t>
+      </w:r>
+    </w:p>
+    <w:p>
+      <w:pPr>
+        <w:spacing w:after="160"/>
+      </w:pPr>
+      <w:r>
+        <w:t xml:space="preserve">Conclusion for this experiment: the mitigation was tested, not assumed, and the straightforward version of it should be rejected as stated. A more promising next step — out of scope for this revision but recorded for future work — would be a demand-aware reserve that only activates during a detected Emergency cluster (two or more Emergency calls within a short window) rather than a permanent, always-on reservation, combined with clinical sign-off on whether the 10-minute Emergency SLA is realistic for the hospital's actual physical layout.</w:t>
       </w:r>
     </w:p>
     <w:p>
@@ -2751,6 +3686,19 @@
     </w:p>
     <w:p>
       <w:pPr>
+        <w:pStyle w:val="ListParagraph"/>
+        <w:numPr>
+          <w:ilvl w:val="0"/>
+          <w:numId w:val="2"/>
+        </w:numPr>
+        <w:spacing w:after="80"/>
+      </w:pPr>
+      <w:r>
+        <w:t xml:space="preserve">If a reserved-porter policy for Emergency transfers is considered operationally, pilot it against real demand clustering data first — Section 6.7 found that a naively-sized, always-on reservation can make Emergency performance worse, not better. A demand-aware variant (reserve activates only during a detected multi-Emergency cluster) should be modelled and tested before committing shift rosters to it.</w:t>
+      </w:r>
+    </w:p>
+    <w:p>
+      <w:pPr>
         <w:pStyle w:val="Heading2"/>
         <w:spacing w:after="120" w:before="240"/>
       </w:pPr>
@@ -2794,7 +3742,7 @@
         <w:spacing w:after="80"/>
       </w:pPr>
       <w:r>
-        <w:t xml:space="preserve">Section 6.5's finding — that Emergency SLA breaches are partly a staffing/positioning problem, not purely a software problem — should be escalated to hospital operations leadership alongside the software rollout, not treated as solved by the software alone.</w:t>
+        <w:t xml:space="preserve">Section 6.5 and 6.7's findings — that the remaining Emergency SLA gap is partly a staffing/capacity and physical-travel-time problem, not purely a software allocation problem — should be escalated to hospital operations leadership alongside the software rollout, not treated as solved by the software alone.</w:t>
       </w:r>
     </w:p>
     <w:p>

</xml_diff>

<commit_message>
Review 3: mitigation experiment, unit tests, docs, bugfixes, updated report
</commit_message>
<xml_diff>
--- a/outputs/Hospital_Transport_Tracker_Report.docx
+++ b/outputs/Hospital_Transport_Tracker_Report.docx
@@ -94,7 +94,7 @@
           <w:sz w:val="22"/>
           <w:szCs w:val="22"/>
         </w:rPr>
-        <w:t xml:space="preserve">5 October 2026</w:t>
+        <w:t xml:space="preserve">8 October 2026</w:t>
       </w:r>
     </w:p>
     <w:p>
@@ -291,6 +291,19 @@
       </w:pPr>
       <w:r>
         <w:t xml:space="preserve">A bug found and fixed while building the above. While cross-checking the mitigation engine against the original Review 1 engine for an exact baseline comparison, an inconsistency was found in how simulate_queue() handled an unresolved source location: it picked a porter as if the job were in a default zone, but then charged zero travel distance for that same job. This has been fixed (Section 6.1 numbers below reflect the corrected engine); the direction and shape of every Review 1 conclusion is unchanged, but the exact Emergency miss-rate figure shifts from 42.5% to 43.7% as a result. This is reported here rather than quietly — the whole point of Section 5's edge-case tests and this fix is that the system should fail visibly, including to its own author.</w:t>
+      </w:r>
+    </w:p>
+    <w:p>
+      <w:pPr>
+        <w:pStyle w:val="ListParagraph"/>
+        <w:numPr>
+          <w:ilvl w:val="0"/>
+          <w:numId w:val="2"/>
+        </w:numPr>
+        <w:spacing w:after="80"/>
+      </w:pPr>
+      <w:r>
+        <w:t xml:space="preserve">Technical documentation and unit testing (reviewer feedback). Added a 42-test stdlib unit suite (tests/test_engine.py) with a mutation check showing the tests catch injected bugs, plus docs/TESTING.md, docs/ERROR_BOUNDARIES.md and docs/API_AND_SCHEMA.md, and expanded code comments. The code audit that came with this found and fixed one more gap: the app accepted a blank porter on "Confirm assignment" and logged it as a real action; it is now refused with a warning. To be plain about scope: the prototype has no HTTP API or database today, so the endpoint and SQL schema documents are a validated design for the persistence phase, not running code.</w:t>
       </w:r>
     </w:p>
     <w:p>
@@ -1564,6 +1577,31 @@
       <w:pPr>
         <w:spacing w:after="200" w:before="200"/>
       </w:pPr>
+    </w:p>
+    <w:p>
+      <w:pPr>
+        <w:pStyle w:val="Heading2"/>
+        <w:spacing w:after="120" w:before="240"/>
+      </w:pPr>
+      <w:r>
+        <w:t xml:space="preserve">5.1 Unit tests and error boundaries</w:t>
+      </w:r>
+    </w:p>
+    <w:p>
+      <w:pPr>
+        <w:spacing w:after="160"/>
+      </w:pPr>
+      <w:r>
+        <w:t xml:space="preserve">Beneath the scenario cases above sit 42 function-level unit tests (tests/test_engine.py, Python standard library only), one test class per engine function: location parsing (5), request validation (10), priority scoring (6), porter recommendation (5), SLA state detection (7), queue simulation (5) and the reserved-pool variant (4). Key boundaries pinned: unknown urgency can never become Routine; an aged Routine request (max score 66) can never outrank a fresh Emergency (min 100); recommendation functions never modify roster state; bad timestamps are flagged, never turned into negative durations.</w:t>
+      </w:r>
+    </w:p>
+    <w:p>
+      <w:pPr>
+        <w:spacing w:after="160"/>
+      </w:pPr>
+      <w:r>
+        <w:t xml:space="preserve">To check the tests are not just passing by luck, three bugs were deliberately injected (urgency defaulting to Routine, aging cap removed, the original zone-fallback bug re-introduced). All three are now caught; the third initially slipped through, so its regression test was rewritten to make the bug change an observable SLA outcome. Full boundary map, residual risks and a manual click-through checklist are in docs/ERROR_BOUNDARIES.md and docs/TESTING.md.</w:t>
+      </w:r>
     </w:p>
     <w:p>
       <w:pPr>

</xml_diff>